<commit_message>
docs: update repository link to Dips7/contractive-latent-reasoning
</commit_message>
<xml_diff>
--- a/submission_package/04_Manuscript_Full.docx
+++ b/submission_package/04_Manuscript_Full.docx
@@ -53,7 +53,7 @@
           <w:b/>
           <w:vertAlign w:val="superscript"/>
         </w:rPr>
-        <w:t>1</w:t>
+        <w:t>2</w:t>
       </w:r>
       <w:r>
         <w:rPr>
@@ -66,7 +66,7 @@
           <w:b/>
           <w:vertAlign w:val="superscript"/>
         </w:rPr>
-        <w:t>2</w:t>
+        <w:t>1</w:t>
       </w:r>
     </w:p>
     <w:p>
@@ -78,6 +78,21 @@
         <w:rPr>
           <w:vertAlign w:val="superscript"/>
         </w:rPr>
+        <w:t>2</w:t>
+      </w:r>
+      <w:r>
+        <w:t>Lord Buddha Education Foundation, Kathmandu 44600, Nepal</w:t>
+      </w:r>
+      <w:r>
+        <w:rPr>
+          <w:vertAlign w:val="superscript"/>
+        </w:rPr>
+        <w:br/>
+      </w:r>
+      <w:r>
+        <w:rPr>
+          <w:vertAlign w:val="superscript"/>
+        </w:rPr>
         <w:t>1</w:t>
       </w:r>
       <w:r>
@@ -85,15 +100,6 @@
       </w:r>
       <w:r>
         <w:br/>
-      </w:r>
-      <w:r>
-        <w:rPr>
-          <w:vertAlign w:val="superscript"/>
-        </w:rPr>
-        <w:t>2</w:t>
-      </w:r>
-      <w:r>
-        <w:t>Department of Information Technology, Lord Buddha Education Foundation, Kathmandu 44600, Nepal</w:t>
       </w:r>
       <w:r>
         <w:br/>

</xml_diff>

<commit_message>
docs(citations): resolve citation audit (revert Sen page to 93, cite Sen in Cora benchmark, add Kipf & Welling and Chamberlain et al., remove orphan Soudry)
</commit_message>
<xml_diff>
--- a/submission_package/04_Manuscript_Full.docx
+++ b/submission_package/04_Manuscript_Full.docx
@@ -5685,7 +5685,7 @@
           <w:rFonts w:ascii="Times New Roman" w:hAnsi="Times New Roman"/>
           <w:sz w:val="23"/>
         </w:rPr>
-        <w:t>We evaluate multi-hop citation reachability on the Cora academic network (2,708 papers, 5,429 directed citations). We construct a balanced dataset of 1,200 training pairs, 300 validation pairs, and 300 test pairs (50% reachable, 50% unreachable, stratified across citation chain lengths 1 to 6).</w:t>
+        <w:t>We evaluate multi-hop citation reachability on the Cora academic network (Sen et al., 2008; 2,708 papers, 5,429 directed citations). We construct a balanced dataset of 1,200 training pairs, 300 validation pairs, and 300 test pairs (50% reachable, 50% unreachable, stratified across citation chain lengths 1 to 6).</w:t>
       </w:r>
     </w:p>
     <w:tbl>
@@ -8423,7 +8423,7 @@
           <w:rFonts w:ascii="Times New Roman" w:hAnsi="Times New Roman"/>
           <w:sz w:val="23"/>
         </w:rPr>
-        <w:t>Neural ODEs &amp; Over-smoothing in GNNs: Neural ODEs (Chen et al., 2018) model depth as time but lack contraction guarantees. Stacking discrete GNN layers leads to exponential information loss and over-smoothing (Li et al., 2018; Rusch et al., 2022). CLR bypasses discrete depth constraints, solving 6-hop queries without intermediate degradation.</w:t>
+        <w:t>Continuous Graph Diffusion &amp; Over-smoothing in Deep GNNs: Neural ODEs (Chen et al., 2018) model depth as continuous time but lack contraction guarantees. In graph representation learning, discrete Graph Convolutional Networks (GCNs; Kipf &amp; Welling, 2017) suffer from exponential information loss and over-smoothing as depth increases (Li et al., 2018). While continuous graph neural diffusion (GRAND; Chamberlain et al., 2021) and graph-coupled oscillator networks (GraphCON; Rusch et al., 2022) address feature collapse in deep graph models, CLR specifically introduces strict Demidovich operator-norm contraction to latent reasoning dynamics. This guarantees exponential convergence to a unique problem-conditioned equilibrium, bypassing discrete depth saturation to resolve 6-hop queries without intermediate degradation.</w:t>
       </w:r>
     </w:p>
     <w:p>
@@ -8653,6 +8653,19 @@
           <w:rFonts w:ascii="Times New Roman" w:hAnsi="Times New Roman"/>
           <w:sz w:val="21"/>
         </w:rPr>
+        <w:t>Chamberlain, B. P., Rowbottom, J., Goranova, M. I., Webb, S., Rossi, E., &amp; Bronstein, M. M. (2021). GRAND: Graph neural diffusion. International Conference on Machine Learning (ICML), 1407-1418.</w:t>
+      </w:r>
+    </w:p>
+    <w:p>
+      <w:pPr>
+        <w:spacing w:after="80" w:line="276" w:lineRule="auto"/>
+        <w:ind w:left="576" w:hanging="576"/>
+      </w:pPr>
+      <w:r>
+        <w:rPr>
+          <w:rFonts w:ascii="Times New Roman" w:hAnsi="Times New Roman"/>
+          <w:sz w:val="21"/>
+        </w:rPr>
         <w:t>Chen, R. T., Rubanova, Y., Bettencourt, J., &amp; Duvenaud, D. K. (2018). Neural ordinary differential equations. Advances in Neural Information Processing Systems (NeurIPS), 31.</w:t>
       </w:r>
     </w:p>
@@ -8667,6 +8680,19 @@
           <w:sz w:val="21"/>
         </w:rPr>
         <w:t>Demidovich, B. P. (1961). Dissipativity of a nonlinear system of differential equations. Vestnik Moskovskogo Universiteta. Seriya I. Matematika, Mekhanika, 6, 19-27.</w:t>
+      </w:r>
+    </w:p>
+    <w:p>
+      <w:pPr>
+        <w:spacing w:after="80" w:line="276" w:lineRule="auto"/>
+        <w:ind w:left="576" w:hanging="576"/>
+      </w:pPr>
+      <w:r>
+        <w:rPr>
+          <w:rFonts w:ascii="Times New Roman" w:hAnsi="Times New Roman"/>
+          <w:sz w:val="21"/>
+        </w:rPr>
+        <w:t>Kipf, T. N., &amp; Welling, M. (2017). Semi-supervised classification with graph convolutional networks. International Conference on Learning Representations (ICLR).</w:t>
       </w:r>
     </w:p>
     <w:p>
@@ -8718,7 +8744,7 @@
           <w:rFonts w:ascii="Times New Roman" w:hAnsi="Times New Roman"/>
           <w:sz w:val="21"/>
         </w:rPr>
-        <w:t>Sen, P., Namata, G., Bilgic, M., Getoor, L., Galligher, B., &amp; Eliassi-Rad, T. (2008). Collective classification in network data. AI Magazine, 29(3), 93-93.</w:t>
+        <w:t>Sen, P., Namata, G., Bilgic, M., Getoor, L., Galligher, B., &amp; Eliassi-Rad, T. (2008). Collective classification in network data. AI Magazine, 29(3), 93.</w:t>
       </w:r>
     </w:p>
     <w:p>

</xml_diff>